<commit_message>
Updated Loguru cheat sheet
</commit_message>
<xml_diff>
--- a/Loguru cheat sheet.docx
+++ b/Loguru cheat sheet.docx
@@ -1,6 +1,6 @@
 
 <file path=word/document.xml><?xml version="1.0" encoding="utf-8"?>
-<w:document xmlns:wpc="http://schemas.microsoft.com/office/word/2010/wordprocessingCanvas" xmlns:cx="http://schemas.microsoft.com/office/drawing/2014/chartex" xmlns:cx1="http://schemas.microsoft.com/office/drawing/2015/9/8/chartex" xmlns:cx2="http://schemas.microsoft.com/office/drawing/2015/10/21/chartex" xmlns:cx3="http://schemas.microsoft.com/office/drawing/2016/5/9/chartex" xmlns:cx4="http://schemas.microsoft.com/office/drawing/2016/5/10/chartex" xmlns:cx5="http://schemas.microsoft.com/office/drawing/2016/5/11/chartex" xmlns:cx6="http://schemas.microsoft.com/office/drawing/2016/5/12/chartex" xmlns:cx7="http://schemas.microsoft.com/office/drawing/2016/5/13/chartex" xmlns:cx8="http://schemas.microsoft.com/office/drawing/2016/5/14/chartex" xmlns:mc="http://schemas.openxmlformats.org/markup-compatibility/2006" xmlns:aink="http://schemas.microsoft.com/office/drawing/2016/ink" xmlns:am3d="http://schemas.microsoft.com/office/drawing/2017/model3d" xmlns:o="urn:schemas-microsoft-com:office:office" xmlns:oel="http://schemas.microsoft.com/office/2019/extlst" xmlns:r="http://schemas.openxmlformats.org/officeDocument/2006/relationships" xmlns:m="http://schemas.openxmlformats.org/officeDocument/2006/math" xmlns:v="urn:schemas-microsoft-com:vml" xmlns:wp14="http://schemas.microsoft.com/office/word/2010/wordprocessingDrawing" xmlns:wp="http://schemas.openxmlformats.org/drawingml/2006/wordprocessingDrawing" xmlns:w10="urn:schemas-microsoft-com:office:word" xmlns:w="http://schemas.openxmlformats.org/wordprocessingml/2006/main" xmlns:w14="http://schemas.microsoft.com/office/word/2010/wordml" xmlns:w15="http://schemas.microsoft.com/office/word/2012/wordml" xmlns:w16cex="http://schemas.microsoft.com/office/word/2018/wordml/cex" xmlns:w16cid="http://schemas.microsoft.com/office/word/2016/wordml/cid" xmlns:w16="http://schemas.microsoft.com/office/word/2018/wordml" xmlns:w16du="http://schemas.microsoft.com/office/word/2023/wordml/word16du" xmlns:w16sdtdh="http://schemas.microsoft.com/office/word/2020/wordml/sdtdatahash" xmlns:w16sdtfl="http://schemas.microsoft.com/office/word/2024/wordml/sdtformatlock" xmlns:w16se="http://schemas.microsoft.com/office/word/2015/wordml/symex" xmlns:wpg="http://schemas.microsoft.com/office/word/2010/wordprocessingGroup" xmlns:wpi="http://schemas.microsoft.com/office/word/2010/wordprocessingInk" xmlns:wne="http://schemas.microsoft.com/office/word/2006/wordml" xmlns:wps="http://schemas.microsoft.com/office/word/2010/wordprocessingShape" mc:Ignorable="w14 w15 w16se w16cid w16 w16cex w16sdtdh w16sdtfl w16du wp14">
+<w:document xmlns:wpc="http://schemas.microsoft.com/office/word/2010/wordprocessingCanvas" xmlns:cx="http://schemas.microsoft.com/office/drawing/2014/chartex" xmlns:cx1="http://schemas.microsoft.com/office/drawing/2015/9/8/chartex" xmlns:cx2="http://schemas.microsoft.com/office/drawing/2015/10/21/chartex" xmlns:cx3="http://schemas.microsoft.com/office/drawing/2016/5/9/chartex" xmlns:cx4="http://schemas.microsoft.com/office/drawing/2016/5/10/chartex" xmlns:cx5="http://schemas.microsoft.com/office/drawing/2016/5/11/chartex" xmlns:cx6="http://schemas.microsoft.com/office/drawing/2016/5/12/chartex" xmlns:cx7="http://schemas.microsoft.com/office/drawing/2016/5/13/chartex" xmlns:cx8="http://schemas.microsoft.com/office/drawing/2016/5/14/chartex" xmlns:mc="http://schemas.openxmlformats.org/markup-compatibility/2006" xmlns:aink="http://schemas.microsoft.com/office/drawing/2016/ink" xmlns:am3d="http://schemas.microsoft.com/office/drawing/2017/model3d" xmlns:o="urn:schemas-microsoft-com:office:office" xmlns:r="http://schemas.openxmlformats.org/officeDocument/2006/relationships" xmlns:m="http://schemas.openxmlformats.org/officeDocument/2006/math" xmlns:v="urn:schemas-microsoft-com:vml" xmlns:wp14="http://schemas.microsoft.com/office/word/2010/wordprocessingDrawing" xmlns:wp="http://schemas.openxmlformats.org/drawingml/2006/wordprocessingDrawing" xmlns:w10="urn:schemas-microsoft-com:office:word" xmlns:w="http://schemas.openxmlformats.org/wordprocessingml/2006/main" xmlns:w14="http://schemas.microsoft.com/office/word/2010/wordml" xmlns:w15="http://schemas.microsoft.com/office/word/2012/wordml" xmlns:w16cex="http://schemas.microsoft.com/office/word/2018/wordml/cex" xmlns:w16cid="http://schemas.microsoft.com/office/word/2016/wordml/cid" xmlns:w16="http://schemas.microsoft.com/office/word/2018/wordml" xmlns:w16sdtdh="http://schemas.microsoft.com/office/word/2020/wordml/sdtdatahash" xmlns:w16se="http://schemas.microsoft.com/office/word/2015/wordml/symex" xmlns:wpg="http://schemas.microsoft.com/office/word/2010/wordprocessingGroup" xmlns:wpi="http://schemas.microsoft.com/office/word/2010/wordprocessingInk" xmlns:wne="http://schemas.microsoft.com/office/word/2006/wordml" xmlns:wps="http://schemas.microsoft.com/office/word/2010/wordprocessingShape" mc:Ignorable="w14 w15 w16se w16cid w16 w16cex w16sdtdh wp14">
   <w:body>
     <w:p>
       <w:pPr>
@@ -96,6 +96,9 @@
     </w:p>
     <w:p>
       <w:r>
+        <w:rPr>
+          <w:noProof/>
+        </w:rPr>
         <w:drawing>
           <wp:inline distT="0" distB="0" distL="0" distR="0" wp14:anchorId="77914509" wp14:editId="3B00F472">
             <wp:extent cx="6080426" cy="2247493"/>
@@ -143,10 +146,7 @@
     </w:p>
     <w:p>
       <w:r>
-        <w:t>B</w:t>
-      </w:r>
-      <w:r>
-        <w:t xml:space="preserve">y default, </w:t>
+        <w:t xml:space="preserve">By default, </w:t>
       </w:r>
       <w:proofErr w:type="spellStart"/>
       <w:r>
@@ -191,6 +191,9 @@
     </w:p>
     <w:p>
       <w:r>
+        <w:rPr>
+          <w:noProof/>
+        </w:rPr>
         <w:lastRenderedPageBreak/>
         <w:drawing>
           <wp:inline distT="0" distB="0" distL="0" distR="0" wp14:anchorId="29D009CE" wp14:editId="665EE31A">
@@ -239,15 +242,7 @@
     </w:p>
     <w:p>
       <w:r>
-        <w:t xml:space="preserve">You can customize exactly how your logs </w:t>
-      </w:r>
-      <w:proofErr w:type="gramStart"/>
-      <w:r>
-        <w:t>look</w:t>
-      </w:r>
-      <w:proofErr w:type="gramEnd"/>
-      <w:r>
-        <w:t xml:space="preserve"> and which logs get saved.</w:t>
+        <w:t>You can customize exactly how your logs look and which logs get saved.</w:t>
       </w:r>
     </w:p>
     <w:p>
@@ -335,7 +330,6 @@
         <w:t>"special.log", format="{</w:t>
       </w:r>
       <w:proofErr w:type="spellStart"/>
-      <w:proofErr w:type="gramStart"/>
       <w:r>
         <w:rPr>
           <w:rFonts w:ascii="Courier New" w:eastAsia="Times New Roman" w:hAnsi="Courier New" w:cs="Courier New"/>
@@ -344,18 +338,7 @@
           <w:szCs w:val="20"/>
           <w14:ligatures w14:val="none"/>
         </w:rPr>
-        <w:t>time:YYYY</w:t>
-      </w:r>
-      <w:proofErr w:type="gramEnd"/>
-      <w:r>
-        <w:rPr>
-          <w:rFonts w:ascii="Courier New" w:eastAsia="Times New Roman" w:hAnsi="Courier New" w:cs="Courier New"/>
-          <w:kern w:val="0"/>
-          <w:sz w:val="20"/>
-          <w:szCs w:val="20"/>
-          <w14:ligatures w14:val="none"/>
-        </w:rPr>
-        <w:t>-MM-DD</w:t>
+        <w:t>time:YYYY-MM-DD</w:t>
       </w:r>
       <w:proofErr w:type="spellEnd"/>
       <w:r>
@@ -525,15 +508,7 @@
         <w:pStyle w:val="NormalWeb"/>
       </w:pPr>
       <w:r>
-        <w:t xml:space="preserve">Standard logging often loses the "traceback" (where the code </w:t>
-      </w:r>
-      <w:proofErr w:type="gramStart"/>
-      <w:r>
-        <w:t>actually broke</w:t>
-      </w:r>
-      <w:proofErr w:type="gramEnd"/>
-      <w:r>
-        <w:t xml:space="preserve">). </w:t>
+        <w:t xml:space="preserve">Standard logging often loses the "traceback" (where the code actually broke). </w:t>
       </w:r>
       <w:proofErr w:type="spellStart"/>
       <w:r>
@@ -546,6 +521,9 @@
     </w:p>
     <w:p>
       <w:r>
+        <w:rPr>
+          <w:noProof/>
+        </w:rPr>
         <w:lastRenderedPageBreak/>
         <w:drawing>
           <wp:inline distT="0" distB="0" distL="0" distR="0" wp14:anchorId="57A3BF5F" wp14:editId="25219076">
@@ -602,6 +580,9 @@
     </w:p>
     <w:p>
       <w:r>
+        <w:rPr>
+          <w:noProof/>
+        </w:rPr>
         <w:drawing>
           <wp:inline distT="0" distB="0" distL="0" distR="0" wp14:anchorId="32878F90" wp14:editId="000D905E">
             <wp:extent cx="5673285" cy="1036139"/>
@@ -675,6 +656,9 @@
     </w:p>
     <w:p>
       <w:r>
+        <w:rPr>
+          <w:noProof/>
+        </w:rPr>
         <w:drawing>
           <wp:inline distT="0" distB="0" distL="0" distR="0" wp14:anchorId="10830D2E" wp14:editId="450094EC">
             <wp:extent cx="5539796" cy="1778400"/>
@@ -777,56 +761,44 @@
       </w:r>
       <w:proofErr w:type="spellEnd"/>
       <w:r>
-        <w:t>).</w:t>
-      </w:r>
+        <w:t>).log(</w:t>
+      </w:r>
+      <w:proofErr w:type="spellStart"/>
+      <w:r>
+        <w:t>record.levelname</w:t>
+      </w:r>
+      <w:proofErr w:type="spellEnd"/>
+      <w:r>
+        <w:t xml:space="preserve">, </w:t>
+      </w:r>
+      <w:proofErr w:type="spellStart"/>
+      <w:r>
+        <w:t>record.getMessage</w:t>
+      </w:r>
+      <w:proofErr w:type="spellEnd"/>
+      <w:r>
+        <w:t>())</w:t>
+      </w:r>
+    </w:p>
+    <w:p/>
+    <w:p>
+      <w:proofErr w:type="spellStart"/>
       <w:proofErr w:type="gramStart"/>
       <w:r>
-        <w:t>log(</w:t>
-      </w:r>
-      <w:proofErr w:type="spellStart"/>
-      <w:r>
-        <w:t>record.levelname</w:t>
+        <w:t>logging.basicConfig</w:t>
       </w:r>
       <w:proofErr w:type="spellEnd"/>
       <w:proofErr w:type="gramEnd"/>
       <w:r>
-        <w:t xml:space="preserve">, </w:t>
+        <w:t>(handlers=[</w:t>
       </w:r>
       <w:proofErr w:type="spellStart"/>
-      <w:proofErr w:type="gramStart"/>
-      <w:r>
-        <w:t>record.getMessage</w:t>
+      <w:r>
+        <w:t>InterceptHandler</w:t>
       </w:r>
       <w:proofErr w:type="spellEnd"/>
-      <w:proofErr w:type="gramEnd"/>
-      <w:r>
-        <w:t>())</w:t>
-      </w:r>
-    </w:p>
-    <w:p/>
-    <w:p>
-      <w:proofErr w:type="spellStart"/>
-      <w:proofErr w:type="gramStart"/>
-      <w:r>
-        <w:t>logging.basicConfig</w:t>
-      </w:r>
-      <w:proofErr w:type="spellEnd"/>
-      <w:proofErr w:type="gramEnd"/>
-      <w:r>
-        <w:t>(handlers=[</w:t>
-      </w:r>
-      <w:proofErr w:type="spellStart"/>
-      <w:proofErr w:type="gramStart"/>
-      <w:r>
-        <w:t>InterceptHandler</w:t>
-      </w:r>
-      <w:proofErr w:type="spellEnd"/>
-      <w:r>
-        <w:t>(</w:t>
-      </w:r>
-      <w:proofErr w:type="gramEnd"/>
-      <w:r>
-        <w:t>)], level=0)</w:t>
+      <w:r>
+        <w:t>()], level=0)</w:t>
       </w:r>
     </w:p>
     <w:p>
@@ -1590,18 +1562,7 @@
                 <w:bdr w:val="none" w:sz="0" w:space="0" w:color="auto" w:frame="1"/>
                 <w14:ligatures w14:val="none"/>
               </w:rPr>
-              <w:t xml:space="preserve"> (clears all </w:t>
-            </w:r>
-            <w:proofErr w:type="gramStart"/>
-            <w:r>
-              <w:rPr>
-                <w:rFonts w:ascii="Arial" w:eastAsia="Times New Roman" w:hAnsi="Arial" w:cs="Arial"/>
-                <w:color w:val="1F1F1F"/>
-                <w:kern w:val="0"/>
-                <w:bdr w:val="none" w:sz="0" w:space="0" w:color="auto" w:frame="1"/>
-                <w14:ligatures w14:val="none"/>
-              </w:rPr>
-              <w:t xml:space="preserve">previous </w:t>
+              <w:t xml:space="preserve"> (clears all previous </w:t>
             </w:r>
             <w:r>
               <w:rPr>
@@ -1615,7 +1576,6 @@
               </w:rPr>
               <w:t>.add</w:t>
             </w:r>
-            <w:proofErr w:type="gramEnd"/>
             <w:r>
               <w:rPr>
                 <w:rFonts w:ascii="Arial" w:eastAsia="Times New Roman" w:hAnsi="Arial" w:cs="Arial"/>
@@ -1693,6 +1653,9 @@
     </w:p>
     <w:p>
       <w:r>
+        <w:rPr>
+          <w:noProof/>
+        </w:rPr>
         <w:drawing>
           <wp:inline distT="0" distB="0" distL="0" distR="0" wp14:anchorId="03F3AB7E" wp14:editId="3AD905F0">
             <wp:extent cx="4533900" cy="1879600"/>
@@ -1735,10 +1698,7 @@
         <w:pStyle w:val="Heading2"/>
       </w:pPr>
       <w:r>
-        <w:t>The Context Manager (For specific blocks)</w:t>
-      </w:r>
-      <w:r>
-        <w:t>2</w:t>
+        <w:t>The Context Manager (For specific blocks)2</w:t>
       </w:r>
     </w:p>
     <w:p>
@@ -1783,6 +1743,9 @@
         <w:pStyle w:val="NormalWeb"/>
       </w:pPr>
       <w:r>
+        <w:rPr>
+          <w:noProof/>
+        </w:rPr>
         <w:drawing>
           <wp:inline distT="0" distB="0" distL="0" distR="0" wp14:anchorId="478874B4" wp14:editId="52F8360A">
             <wp:extent cx="4899048" cy="1431764"/>
@@ -1956,22 +1919,14 @@
     </w:p>
     <w:p>
       <w:r>
-        <w:t xml:space="preserve">Since you mentioned working on automation scripts, you can combine the "catch" feature with a log file. This way, if your script crashes while you aren't looking, you can open the log file and see exactly what the variable values were </w:t>
-      </w:r>
-      <w:proofErr w:type="gramStart"/>
-      <w:r>
-        <w:t>at the moment</w:t>
-      </w:r>
-      <w:proofErr w:type="gramEnd"/>
-      <w:r>
-        <w:t xml:space="preserve"> of the cras</w:t>
-      </w:r>
-      <w:r>
-        <w:t>h</w:t>
-      </w:r>
-    </w:p>
-    <w:p>
-      <w:r>
+        <w:t>Since you mentioned working on automation scripts, you can combine the "catch" feature with a log file. This way, if your script crashes while you aren't looking, you can open the log file and see exactly what the variable values were at the moment of the crash</w:t>
+      </w:r>
+    </w:p>
+    <w:p>
+      <w:r>
+        <w:rPr>
+          <w:noProof/>
+        </w:rPr>
         <w:lastRenderedPageBreak/>
         <w:drawing>
           <wp:inline distT="0" distB="0" distL="0" distR="0" wp14:anchorId="79C267BD" wp14:editId="46D64B70">
@@ -2020,15 +1975,7 @@
         <w:t>backtrace=True</w:t>
       </w:r>
       <w:r>
-        <w:t xml:space="preserve"> shows the path the code </w:t>
-      </w:r>
-      <w:proofErr w:type="gramStart"/>
-      <w:r>
-        <w:t>took, and</w:t>
-      </w:r>
-      <w:proofErr w:type="gramEnd"/>
-      <w:r>
-        <w:t xml:space="preserve"> </w:t>
+        <w:t xml:space="preserve"> shows the path the code took, and </w:t>
       </w:r>
       <w:r>
         <w:rPr>
@@ -2071,6 +2018,9 @@
     </w:p>
     <w:p>
       <w:r>
+        <w:rPr>
+          <w:noProof/>
+        </w:rPr>
         <w:drawing>
           <wp:inline distT="0" distB="0" distL="0" distR="0" wp14:anchorId="3AEC040C" wp14:editId="1AC982A4">
             <wp:extent cx="4089400" cy="1892300"/>
@@ -2109,10 +2059,603 @@
       </w:r>
     </w:p>
     <w:p>
-      <w:r>
-        <w:t>To be continued…</w:t>
-      </w:r>
-    </w:p>
+      <w:pPr>
+        <w:pStyle w:val="Heading1"/>
+      </w:pPr>
+      <w:r>
+        <w:t>Config file</w:t>
+      </w:r>
+    </w:p>
+    <w:p>
+      <w:r>
+        <w:t xml:space="preserve">Instead of just a "config" file that holds variables, create a module that handles the logic of setting up </w:t>
+      </w:r>
+      <w:proofErr w:type="spellStart"/>
+      <w:r>
+        <w:t>Loguru</w:t>
+      </w:r>
+      <w:proofErr w:type="spellEnd"/>
+      <w:r>
+        <w:t>.</w:t>
+      </w:r>
+    </w:p>
+    <w:p/>
+    <w:p>
+      <w:pPr>
+        <w:pStyle w:val="Heading2"/>
+        <w:rPr>
+          <w:rStyle w:val="HTMLCode"/>
+          <w:rFonts w:eastAsiaTheme="majorEastAsia"/>
+          <w:sz w:val="32"/>
+          <w:szCs w:val="32"/>
+        </w:rPr>
+      </w:pPr>
+      <w:proofErr w:type="gramStart"/>
+      <w:r>
+        <w:t xml:space="preserve">Create </w:t>
+      </w:r>
+      <w:r>
+        <w:t xml:space="preserve"> </w:t>
+      </w:r>
+      <w:r>
+        <w:rPr>
+          <w:rStyle w:val="HTMLCode"/>
+          <w:rFonts w:eastAsiaTheme="majorEastAsia"/>
+          <w:sz w:val="32"/>
+          <w:szCs w:val="32"/>
+          <w:highlight w:val="yellow"/>
+        </w:rPr>
+        <w:t>module_name</w:t>
+      </w:r>
+      <w:r>
+        <w:rPr>
+          <w:rStyle w:val="HTMLCode"/>
+          <w:rFonts w:eastAsiaTheme="majorEastAsia"/>
+          <w:sz w:val="32"/>
+          <w:szCs w:val="32"/>
+          <w:highlight w:val="yellow"/>
+        </w:rPr>
+        <w:t>/logging_setup.py</w:t>
+      </w:r>
+      <w:proofErr w:type="gramEnd"/>
+    </w:p>
+    <w:p>
+      <w:pPr>
+        <w:rPr>
+          <w:rStyle w:val="hljs-keyword"/>
+        </w:rPr>
+      </w:pPr>
+    </w:p>
+    <w:p>
+      <w:r>
+        <w:t>import sys</w:t>
+      </w:r>
+    </w:p>
+    <w:p>
+      <w:r>
+        <w:t xml:space="preserve">from </w:t>
+      </w:r>
+      <w:proofErr w:type="spellStart"/>
+      <w:r>
+        <w:t>loguru</w:t>
+      </w:r>
+      <w:proofErr w:type="spellEnd"/>
+      <w:r>
+        <w:t xml:space="preserve"> import logger</w:t>
+      </w:r>
+    </w:p>
+    <w:p/>
+    <w:p>
+      <w:r>
+        <w:t xml:space="preserve">def </w:t>
+      </w:r>
+      <w:proofErr w:type="spellStart"/>
+      <w:r>
+        <w:t>init_</w:t>
+      </w:r>
+      <w:proofErr w:type="gramStart"/>
+      <w:r>
+        <w:t>logging</w:t>
+      </w:r>
+      <w:proofErr w:type="spellEnd"/>
+      <w:r>
+        <w:t>(</w:t>
+      </w:r>
+      <w:proofErr w:type="gramEnd"/>
+      <w:r>
+        <w:t>):</w:t>
+      </w:r>
+    </w:p>
+    <w:p>
+      <w:r>
+        <w:t xml:space="preserve">    """Initializes the global </w:t>
+      </w:r>
+      <w:proofErr w:type="spellStart"/>
+      <w:r>
+        <w:t>Loguru</w:t>
+      </w:r>
+      <w:proofErr w:type="spellEnd"/>
+      <w:r>
+        <w:t xml:space="preserve"> logger configuration."""</w:t>
+      </w:r>
+    </w:p>
+    <w:p>
+      <w:r>
+        <w:t xml:space="preserve">    </w:t>
+      </w:r>
+      <w:proofErr w:type="spellStart"/>
+      <w:proofErr w:type="gramStart"/>
+      <w:r>
+        <w:t>logger.remove</w:t>
+      </w:r>
+      <w:proofErr w:type="spellEnd"/>
+      <w:proofErr w:type="gramEnd"/>
+      <w:r>
+        <w:t>()  # Clear default handler</w:t>
+      </w:r>
+    </w:p>
+    <w:p/>
+    <w:p>
+      <w:r>
+        <w:t xml:space="preserve">    # Console handler</w:t>
+      </w:r>
+      <w:r>
+        <w:t xml:space="preserve"> (displaying err in console IF exists)</w:t>
+      </w:r>
+    </w:p>
+    <w:p>
+      <w:r>
+        <w:t xml:space="preserve">    </w:t>
+      </w:r>
+      <w:proofErr w:type="spellStart"/>
+      <w:proofErr w:type="gramStart"/>
+      <w:r>
+        <w:t>logger.add</w:t>
+      </w:r>
+      <w:proofErr w:type="spellEnd"/>
+      <w:r>
+        <w:t>(</w:t>
+      </w:r>
+      <w:proofErr w:type="spellStart"/>
+      <w:proofErr w:type="gramEnd"/>
+      <w:r>
+        <w:t>sys.stderr</w:t>
+      </w:r>
+      <w:proofErr w:type="spellEnd"/>
+      <w:r>
+        <w:t>, level="INFO", colorize=True)</w:t>
+      </w:r>
+    </w:p>
+    <w:p/>
+    <w:p>
+      <w:r>
+        <w:t xml:space="preserve">    # File handler</w:t>
+      </w:r>
+    </w:p>
+    <w:p>
+      <w:r>
+        <w:t xml:space="preserve">    </w:t>
+      </w:r>
+      <w:proofErr w:type="spellStart"/>
+      <w:proofErr w:type="gramStart"/>
+      <w:r>
+        <w:t>logger.add</w:t>
+      </w:r>
+      <w:proofErr w:type="spellEnd"/>
+      <w:r>
+        <w:t>(</w:t>
+      </w:r>
+      <w:proofErr w:type="gramEnd"/>
+    </w:p>
+    <w:p>
+      <w:r>
+        <w:t xml:space="preserve">        "logs/app.log",</w:t>
+      </w:r>
+    </w:p>
+    <w:p>
+      <w:r>
+        <w:t xml:space="preserve">        rotation="10 MB",</w:t>
+      </w:r>
+    </w:p>
+    <w:p>
+      <w:r>
+        <w:t xml:space="preserve">        retention="7 days",</w:t>
+      </w:r>
+    </w:p>
+    <w:p>
+      <w:r>
+        <w:t xml:space="preserve">        enqueue=</w:t>
+      </w:r>
+      <w:proofErr w:type="gramStart"/>
+      <w:r>
+        <w:t>True,  #</w:t>
+      </w:r>
+      <w:proofErr w:type="gramEnd"/>
+      <w:r>
+        <w:t xml:space="preserve"> Keeps it safe for complex structures</w:t>
+      </w:r>
+    </w:p>
+    <w:p>
+      <w:r>
+        <w:t xml:space="preserve">        level="DEBUG"</w:t>
+      </w:r>
+      <w:r>
+        <w:t>,</w:t>
+      </w:r>
+    </w:p>
+    <w:p>
+      <w:r>
+        <w:t xml:space="preserve">        </w:t>
+      </w:r>
+      <w:proofErr w:type="spellStart"/>
+      <w:r>
+        <w:t>backtrace</w:t>
+      </w:r>
+      <w:proofErr w:type="spellEnd"/>
+      <w:r>
+        <w:t>=True,</w:t>
+      </w:r>
+    </w:p>
+    <w:p>
+      <w:r>
+        <w:rPr>
+          <w:rStyle w:val="hljs-builtin"/>
+        </w:rPr>
+        <w:t xml:space="preserve">       </w:t>
+      </w:r>
+      <w:r>
+        <w:rPr>
+          <w:rStyle w:val="hljs-builtin"/>
+        </w:rPr>
+        <w:t>format</w:t>
+      </w:r>
+      <w:r>
+        <w:t>=</w:t>
+      </w:r>
+      <w:r>
+        <w:rPr>
+          <w:rStyle w:val="hljs-string"/>
+        </w:rPr>
+        <w:t>"{time} | {level} | {name</w:t>
+      </w:r>
+      <w:proofErr w:type="gramStart"/>
+      <w:r>
+        <w:rPr>
+          <w:rStyle w:val="hljs-string"/>
+        </w:rPr>
+        <w:t>}:{</w:t>
+      </w:r>
+      <w:proofErr w:type="gramEnd"/>
+      <w:r>
+        <w:rPr>
+          <w:rStyle w:val="hljs-string"/>
+        </w:rPr>
+        <w:t>function}:{line} - {message}"</w:t>
+      </w:r>
+      <w:r>
+        <w:t>)</w:t>
+      </w:r>
+      <w:r>
+        <w:t xml:space="preserve">  # this will also provide name of the file(if multiple files) where err </w:t>
+      </w:r>
+      <w:proofErr w:type="spellStart"/>
+      <w:r>
+        <w:t>occured</w:t>
+      </w:r>
+      <w:proofErr w:type="spellEnd"/>
+    </w:p>
+    <w:p>
+      <w:r>
+        <w:t xml:space="preserve">    )</w:t>
+      </w:r>
+    </w:p>
+    <w:p/>
+    <w:p>
+      <w:pPr>
+        <w:pStyle w:val="Heading2"/>
+      </w:pPr>
+      <w:r>
+        <w:t>Use it in main.py</w:t>
+      </w:r>
+    </w:p>
+    <w:p>
+      <w:r>
+        <w:t xml:space="preserve">The key is to call the initialization function at the </w:t>
+      </w:r>
+      <w:r>
+        <w:rPr>
+          <w:b/>
+          <w:bCs/>
+        </w:rPr>
+        <w:t>very top</w:t>
+      </w:r>
+      <w:r>
+        <w:t xml:space="preserve"> of your entry script</w:t>
+      </w:r>
+      <w:r>
+        <w:t>, afterwards, add the rest of imports</w:t>
+      </w:r>
+    </w:p>
+    <w:p>
+      <w:r>
+        <w:lastRenderedPageBreak/>
+        <w:drawing>
+          <wp:inline distT="0" distB="0" distL="0" distR="0" wp14:anchorId="673893F6" wp14:editId="79F05BFA">
+            <wp:extent cx="5943600" cy="2653665"/>
+            <wp:effectExtent l="0" t="0" r="0" b="0"/>
+            <wp:docPr id="1" name="Picture 1"/>
+            <wp:cNvGraphicFramePr>
+              <a:graphicFrameLocks xmlns:a="http://schemas.openxmlformats.org/drawingml/2006/main" noChangeAspect="1"/>
+            </wp:cNvGraphicFramePr>
+            <a:graphic xmlns:a="http://schemas.openxmlformats.org/drawingml/2006/main">
+              <a:graphicData uri="http://schemas.openxmlformats.org/drawingml/2006/picture">
+                <pic:pic xmlns:pic="http://schemas.openxmlformats.org/drawingml/2006/picture">
+                  <pic:nvPicPr>
+                    <pic:cNvPr id="1" name=""/>
+                    <pic:cNvPicPr/>
+                  </pic:nvPicPr>
+                  <pic:blipFill>
+                    <a:blip r:embed="rId14"/>
+                    <a:stretch>
+                      <a:fillRect/>
+                    </a:stretch>
+                  </pic:blipFill>
+                  <pic:spPr>
+                    <a:xfrm>
+                      <a:off x="0" y="0"/>
+                      <a:ext cx="5943600" cy="2653665"/>
+                    </a:xfrm>
+                    <a:prstGeom prst="rect">
+                      <a:avLst/>
+                    </a:prstGeom>
+                  </pic:spPr>
+                </pic:pic>
+              </a:graphicData>
+            </a:graphic>
+          </wp:inline>
+        </w:drawing>
+      </w:r>
+    </w:p>
+    <w:p>
+      <w:pPr>
+        <w:pStyle w:val="Heading2"/>
+      </w:pPr>
+      <w:r>
+        <w:t>Use it in auxiliary modules</w:t>
+      </w:r>
+    </w:p>
+    <w:p>
+      <w:r>
+        <w:t xml:space="preserve">You </w:t>
+      </w:r>
+      <w:r>
+        <w:rPr>
+          <w:b/>
+          <w:bCs/>
+          <w:highlight w:val="yellow"/>
+        </w:rPr>
+        <w:t>must</w:t>
+      </w:r>
+      <w:r>
+        <w:rPr>
+          <w:highlight w:val="yellow"/>
+        </w:rPr>
+        <w:t xml:space="preserve"> import the logger here</w:t>
+      </w:r>
+      <w:r>
+        <w:t xml:space="preserve">. If you don't, Python won't know what </w:t>
+      </w:r>
+      <w:proofErr w:type="gramStart"/>
+      <w:r>
+        <w:rPr>
+          <w:rStyle w:val="HTMLCode"/>
+          <w:rFonts w:eastAsiaTheme="majorEastAsia"/>
+        </w:rPr>
+        <w:t>logger.info(</w:t>
+      </w:r>
+      <w:proofErr w:type="gramEnd"/>
+      <w:r>
+        <w:rPr>
+          <w:rStyle w:val="HTMLCode"/>
+          <w:rFonts w:eastAsiaTheme="majorEastAsia"/>
+        </w:rPr>
+        <w:t>)</w:t>
+      </w:r>
+      <w:r>
+        <w:t xml:space="preserve"> means.</w:t>
+      </w:r>
+    </w:p>
+    <w:p>
+      <w:pPr>
+        <w:pStyle w:val="ListParagraph"/>
+        <w:numPr>
+          <w:ilvl w:val="0"/>
+          <w:numId w:val="3"/>
+        </w:numPr>
+      </w:pPr>
+      <w:r>
+        <w:t>MUST be imported within ALL files where logging is necessary</w:t>
+      </w:r>
+    </w:p>
+    <w:p>
+      <w:r>
+        <w:drawing>
+          <wp:inline distT="0" distB="0" distL="0" distR="0" wp14:anchorId="492F27A7" wp14:editId="02A4DB0B">
+            <wp:extent cx="5943600" cy="1139190"/>
+            <wp:effectExtent l="0" t="0" r="0" b="3810"/>
+            <wp:docPr id="2" name="Picture 2"/>
+            <wp:cNvGraphicFramePr>
+              <a:graphicFrameLocks xmlns:a="http://schemas.openxmlformats.org/drawingml/2006/main" noChangeAspect="1"/>
+            </wp:cNvGraphicFramePr>
+            <a:graphic xmlns:a="http://schemas.openxmlformats.org/drawingml/2006/main">
+              <a:graphicData uri="http://schemas.openxmlformats.org/drawingml/2006/picture">
+                <pic:pic xmlns:pic="http://schemas.openxmlformats.org/drawingml/2006/picture">
+                  <pic:nvPicPr>
+                    <pic:cNvPr id="1" name=""/>
+                    <pic:cNvPicPr/>
+                  </pic:nvPicPr>
+                  <pic:blipFill>
+                    <a:blip r:embed="rId15"/>
+                    <a:stretch>
+                      <a:fillRect/>
+                    </a:stretch>
+                  </pic:blipFill>
+                  <pic:spPr>
+                    <a:xfrm>
+                      <a:off x="0" y="0"/>
+                      <a:ext cx="5943600" cy="1139190"/>
+                    </a:xfrm>
+                    <a:prstGeom prst="rect">
+                      <a:avLst/>
+                    </a:prstGeom>
+                  </pic:spPr>
+                </pic:pic>
+              </a:graphicData>
+            </a:graphic>
+          </wp:inline>
+        </w:drawing>
+      </w:r>
+    </w:p>
+    <w:p>
+      <w:r>
+        <w:t xml:space="preserve">Even though you import </w:t>
+      </w:r>
+      <w:r>
+        <w:rPr>
+          <w:rStyle w:val="HTMLCode"/>
+          <w:rFonts w:eastAsiaTheme="majorEastAsia"/>
+        </w:rPr>
+        <w:t>logger</w:t>
+      </w:r>
+      <w:r>
+        <w:t xml:space="preserve"> in 10 different files, </w:t>
+      </w:r>
+      <w:proofErr w:type="spellStart"/>
+      <w:r>
+        <w:t>Loguru</w:t>
+      </w:r>
+      <w:proofErr w:type="spellEnd"/>
+      <w:r>
+        <w:t xml:space="preserve"> is smart enough to realize they are all part of the same application. It treats them all as one single stream of </w:t>
+      </w:r>
+      <w:r>
+        <w:t>information</w:t>
+      </w:r>
+    </w:p>
+    <w:p>
+      <w:pPr>
+        <w:pStyle w:val="Heading2"/>
+      </w:pPr>
+      <w:r>
+        <w:t>IMPORTANT</w:t>
+      </w:r>
+    </w:p>
+    <w:p>
+      <w:pPr>
+        <w:pStyle w:val="NormalWeb"/>
+        <w:numPr>
+          <w:ilvl w:val="0"/>
+          <w:numId w:val="4"/>
+        </w:numPr>
+      </w:pPr>
+      <w:r>
+        <w:rPr>
+          <w:b/>
+          <w:bCs/>
+        </w:rPr>
+        <w:t>Config:</w:t>
+      </w:r>
+      <w:r>
+        <w:t xml:space="preserve"> Done </w:t>
+      </w:r>
+      <w:r>
+        <w:rPr>
+          <w:b/>
+          <w:bCs/>
+        </w:rPr>
+        <w:t>once</w:t>
+      </w:r>
+      <w:r>
+        <w:t xml:space="preserve"> in a central place (called by </w:t>
+      </w:r>
+      <w:r>
+        <w:rPr>
+          <w:rStyle w:val="HTMLCode"/>
+          <w:rFonts w:eastAsiaTheme="majorEastAsia"/>
+        </w:rPr>
+        <w:t>main.py</w:t>
+      </w:r>
+      <w:r>
+        <w:t>).</w:t>
+      </w:r>
+    </w:p>
+    <w:p>
+      <w:pPr>
+        <w:pStyle w:val="NormalWeb"/>
+        <w:numPr>
+          <w:ilvl w:val="0"/>
+          <w:numId w:val="4"/>
+        </w:numPr>
+      </w:pPr>
+      <w:r>
+        <w:rPr>
+          <w:b/>
+          <w:bCs/>
+        </w:rPr>
+        <w:t>Imports:</w:t>
+      </w:r>
+      <w:r>
+        <w:t xml:space="preserve"> Done in </w:t>
+      </w:r>
+      <w:r>
+        <w:rPr>
+          <w:b/>
+          <w:bCs/>
+        </w:rPr>
+        <w:t>every single file</w:t>
+      </w:r>
+      <w:r>
+        <w:t xml:space="preserve"> that needs to log.</w:t>
+      </w:r>
+    </w:p>
+    <w:p>
+      <w:pPr>
+        <w:pStyle w:val="NormalWeb"/>
+        <w:numPr>
+          <w:ilvl w:val="0"/>
+          <w:numId w:val="4"/>
+        </w:numPr>
+      </w:pPr>
+      <w:r>
+        <w:rPr>
+          <w:b/>
+          <w:bCs/>
+        </w:rPr>
+        <w:t>Sinks (</w:t>
+      </w:r>
+      <w:proofErr w:type="spellStart"/>
+      <w:r>
+        <w:rPr>
+          <w:rStyle w:val="HTMLCode"/>
+          <w:rFonts w:eastAsiaTheme="majorEastAsia"/>
+          <w:b/>
+          <w:bCs/>
+        </w:rPr>
+        <w:t>logger.add</w:t>
+      </w:r>
+      <w:proofErr w:type="spellEnd"/>
+      <w:r>
+        <w:rPr>
+          <w:b/>
+          <w:bCs/>
+        </w:rPr>
+        <w:t>):</w:t>
+      </w:r>
+      <w:r>
+        <w:t xml:space="preserve"> Never put these in your auxiliary files, or you'll end up with 10 different log files or duplicate lines.</w:t>
+      </w:r>
+    </w:p>
+    <w:p/>
     <w:sectPr>
       <w:pgSz w:w="12240" w:h="15840"/>
       <w:pgMar w:top="1440" w:right="1440" w:bottom="1440" w:left="1440" w:header="720" w:footer="720" w:gutter="0"/>
@@ -2124,7 +2667,7 @@
 </file>
 
 <file path=word/numbering.xml><?xml version="1.0" encoding="utf-8"?>
-<w:numbering xmlns:wpc="http://schemas.microsoft.com/office/word/2010/wordprocessingCanvas" xmlns:cx="http://schemas.microsoft.com/office/drawing/2014/chartex" xmlns:cx1="http://schemas.microsoft.com/office/drawing/2015/9/8/chartex" xmlns:cx2="http://schemas.microsoft.com/office/drawing/2015/10/21/chartex" xmlns:cx3="http://schemas.microsoft.com/office/drawing/2016/5/9/chartex" xmlns:cx4="http://schemas.microsoft.com/office/drawing/2016/5/10/chartex" xmlns:cx5="http://schemas.microsoft.com/office/drawing/2016/5/11/chartex" xmlns:cx6="http://schemas.microsoft.com/office/drawing/2016/5/12/chartex" xmlns:cx7="http://schemas.microsoft.com/office/drawing/2016/5/13/chartex" xmlns:cx8="http://schemas.microsoft.com/office/drawing/2016/5/14/chartex" xmlns:mc="http://schemas.openxmlformats.org/markup-compatibility/2006" xmlns:aink="http://schemas.microsoft.com/office/drawing/2016/ink" xmlns:am3d="http://schemas.microsoft.com/office/drawing/2017/model3d" xmlns:o="urn:schemas-microsoft-com:office:office" xmlns:oel="http://schemas.microsoft.com/office/2019/extlst" xmlns:r="http://schemas.openxmlformats.org/officeDocument/2006/relationships" xmlns:m="http://schemas.openxmlformats.org/officeDocument/2006/math" xmlns:v="urn:schemas-microsoft-com:vml" xmlns:wp14="http://schemas.microsoft.com/office/word/2010/wordprocessingDrawing" xmlns:wp="http://schemas.openxmlformats.org/drawingml/2006/wordprocessingDrawing" xmlns:w10="urn:schemas-microsoft-com:office:word" xmlns:w="http://schemas.openxmlformats.org/wordprocessingml/2006/main" xmlns:w14="http://schemas.microsoft.com/office/word/2010/wordml" xmlns:w15="http://schemas.microsoft.com/office/word/2012/wordml" xmlns:w16cex="http://schemas.microsoft.com/office/word/2018/wordml/cex" xmlns:w16cid="http://schemas.microsoft.com/office/word/2016/wordml/cid" xmlns:w16="http://schemas.microsoft.com/office/word/2018/wordml" xmlns:w16du="http://schemas.microsoft.com/office/word/2023/wordml/word16du" xmlns:w16sdtdh="http://schemas.microsoft.com/office/word/2020/wordml/sdtdatahash" xmlns:w16sdtfl="http://schemas.microsoft.com/office/word/2024/wordml/sdtformatlock" xmlns:w16se="http://schemas.microsoft.com/office/word/2015/wordml/symex" xmlns:wpg="http://schemas.microsoft.com/office/word/2010/wordprocessingGroup" xmlns:wpi="http://schemas.microsoft.com/office/word/2010/wordprocessingInk" xmlns:wne="http://schemas.microsoft.com/office/word/2006/wordml" xmlns:wps="http://schemas.microsoft.com/office/word/2010/wordprocessingShape" mc:Ignorable="w14 w15 w16se w16cid w16 w16cex w16sdtdh w16sdtfl w16du wp14">
+<w:numbering xmlns:wpc="http://schemas.microsoft.com/office/word/2010/wordprocessingCanvas" xmlns:cx="http://schemas.microsoft.com/office/drawing/2014/chartex" xmlns:cx1="http://schemas.microsoft.com/office/drawing/2015/9/8/chartex" xmlns:cx2="http://schemas.microsoft.com/office/drawing/2015/10/21/chartex" xmlns:cx3="http://schemas.microsoft.com/office/drawing/2016/5/9/chartex" xmlns:cx4="http://schemas.microsoft.com/office/drawing/2016/5/10/chartex" xmlns:cx5="http://schemas.microsoft.com/office/drawing/2016/5/11/chartex" xmlns:cx6="http://schemas.microsoft.com/office/drawing/2016/5/12/chartex" xmlns:cx7="http://schemas.microsoft.com/office/drawing/2016/5/13/chartex" xmlns:cx8="http://schemas.microsoft.com/office/drawing/2016/5/14/chartex" xmlns:mc="http://schemas.openxmlformats.org/markup-compatibility/2006" xmlns:aink="http://schemas.microsoft.com/office/drawing/2016/ink" xmlns:am3d="http://schemas.microsoft.com/office/drawing/2017/model3d" xmlns:o="urn:schemas-microsoft-com:office:office" xmlns:r="http://schemas.openxmlformats.org/officeDocument/2006/relationships" xmlns:m="http://schemas.openxmlformats.org/officeDocument/2006/math" xmlns:v="urn:schemas-microsoft-com:vml" xmlns:wp14="http://schemas.microsoft.com/office/word/2010/wordprocessingDrawing" xmlns:wp="http://schemas.openxmlformats.org/drawingml/2006/wordprocessingDrawing" xmlns:w10="urn:schemas-microsoft-com:office:word" xmlns:w="http://schemas.openxmlformats.org/wordprocessingml/2006/main" xmlns:w14="http://schemas.microsoft.com/office/word/2010/wordml" xmlns:w15="http://schemas.microsoft.com/office/word/2012/wordml" xmlns:w16cex="http://schemas.microsoft.com/office/word/2018/wordml/cex" xmlns:w16cid="http://schemas.microsoft.com/office/word/2016/wordml/cid" xmlns:w16="http://schemas.microsoft.com/office/word/2018/wordml" xmlns:w16sdtdh="http://schemas.microsoft.com/office/word/2020/wordml/sdtdatahash" xmlns:w16se="http://schemas.microsoft.com/office/word/2015/wordml/symex" xmlns:wpg="http://schemas.microsoft.com/office/word/2010/wordprocessingGroup" xmlns:wpi="http://schemas.microsoft.com/office/word/2010/wordprocessingInk" xmlns:wne="http://schemas.microsoft.com/office/word/2006/wordml" xmlns:wps="http://schemas.microsoft.com/office/word/2010/wordprocessingShape" mc:Ignorable="w14 w15 w16se w16cid w16 w16cex w16sdtdh wp14">
   <w:abstractNum w:abstractNumId="0" w15:restartNumberingAfterBreak="0">
     <w:nsid w:val="1F814A00"/>
     <w:multiLevelType w:val="multilevel"/>
@@ -2363,17 +2906,248 @@
       </w:pPr>
     </w:lvl>
   </w:abstractNum>
-  <w:num w:numId="1" w16cid:durableId="1315984963">
+  <w:abstractNum w:abstractNumId="2" w15:restartNumberingAfterBreak="0">
+    <w:nsid w:val="2C846D22"/>
+    <w:multiLevelType w:val="multilevel"/>
+    <w:tmpl w:val="0416F7F6"/>
+    <w:lvl w:ilvl="0">
+      <w:start w:val="1"/>
+      <w:numFmt w:val="decimal"/>
+      <w:lvlText w:val="%1."/>
+      <w:lvlJc w:val="left"/>
+      <w:pPr>
+        <w:tabs>
+          <w:tab w:val="num" w:pos="720"/>
+        </w:tabs>
+        <w:ind w:left="720" w:hanging="360"/>
+      </w:pPr>
+    </w:lvl>
+    <w:lvl w:ilvl="1" w:tentative="1">
+      <w:start w:val="1"/>
+      <w:numFmt w:val="decimal"/>
+      <w:lvlText w:val="%2."/>
+      <w:lvlJc w:val="left"/>
+      <w:pPr>
+        <w:tabs>
+          <w:tab w:val="num" w:pos="1440"/>
+        </w:tabs>
+        <w:ind w:left="1440" w:hanging="360"/>
+      </w:pPr>
+    </w:lvl>
+    <w:lvl w:ilvl="2" w:tentative="1">
+      <w:start w:val="1"/>
+      <w:numFmt w:val="decimal"/>
+      <w:lvlText w:val="%3."/>
+      <w:lvlJc w:val="left"/>
+      <w:pPr>
+        <w:tabs>
+          <w:tab w:val="num" w:pos="2160"/>
+        </w:tabs>
+        <w:ind w:left="2160" w:hanging="360"/>
+      </w:pPr>
+    </w:lvl>
+    <w:lvl w:ilvl="3" w:tentative="1">
+      <w:start w:val="1"/>
+      <w:numFmt w:val="decimal"/>
+      <w:lvlText w:val="%4."/>
+      <w:lvlJc w:val="left"/>
+      <w:pPr>
+        <w:tabs>
+          <w:tab w:val="num" w:pos="2880"/>
+        </w:tabs>
+        <w:ind w:left="2880" w:hanging="360"/>
+      </w:pPr>
+    </w:lvl>
+    <w:lvl w:ilvl="4" w:tentative="1">
+      <w:start w:val="1"/>
+      <w:numFmt w:val="decimal"/>
+      <w:lvlText w:val="%5."/>
+      <w:lvlJc w:val="left"/>
+      <w:pPr>
+        <w:tabs>
+          <w:tab w:val="num" w:pos="3600"/>
+        </w:tabs>
+        <w:ind w:left="3600" w:hanging="360"/>
+      </w:pPr>
+    </w:lvl>
+    <w:lvl w:ilvl="5" w:tentative="1">
+      <w:start w:val="1"/>
+      <w:numFmt w:val="decimal"/>
+      <w:lvlText w:val="%6."/>
+      <w:lvlJc w:val="left"/>
+      <w:pPr>
+        <w:tabs>
+          <w:tab w:val="num" w:pos="4320"/>
+        </w:tabs>
+        <w:ind w:left="4320" w:hanging="360"/>
+      </w:pPr>
+    </w:lvl>
+    <w:lvl w:ilvl="6" w:tentative="1">
+      <w:start w:val="1"/>
+      <w:numFmt w:val="decimal"/>
+      <w:lvlText w:val="%7."/>
+      <w:lvlJc w:val="left"/>
+      <w:pPr>
+        <w:tabs>
+          <w:tab w:val="num" w:pos="5040"/>
+        </w:tabs>
+        <w:ind w:left="5040" w:hanging="360"/>
+      </w:pPr>
+    </w:lvl>
+    <w:lvl w:ilvl="7" w:tentative="1">
+      <w:start w:val="1"/>
+      <w:numFmt w:val="decimal"/>
+      <w:lvlText w:val="%8."/>
+      <w:lvlJc w:val="left"/>
+      <w:pPr>
+        <w:tabs>
+          <w:tab w:val="num" w:pos="5760"/>
+        </w:tabs>
+        <w:ind w:left="5760" w:hanging="360"/>
+      </w:pPr>
+    </w:lvl>
+    <w:lvl w:ilvl="8" w:tentative="1">
+      <w:start w:val="1"/>
+      <w:numFmt w:val="decimal"/>
+      <w:lvlText w:val="%9."/>
+      <w:lvlJc w:val="left"/>
+      <w:pPr>
+        <w:tabs>
+          <w:tab w:val="num" w:pos="6480"/>
+        </w:tabs>
+        <w:ind w:left="6480" w:hanging="360"/>
+      </w:pPr>
+    </w:lvl>
+  </w:abstractNum>
+  <w:abstractNum w:abstractNumId="3" w15:restartNumberingAfterBreak="0">
+    <w:nsid w:val="70007AFA"/>
+    <w:multiLevelType w:val="hybridMultilevel"/>
+    <w:tmpl w:val="2D988668"/>
+    <w:lvl w:ilvl="0" w:tplc="DC08B714">
+      <w:numFmt w:val="bullet"/>
+      <w:lvlText w:val="-"/>
+      <w:lvlJc w:val="left"/>
+      <w:pPr>
+        <w:ind w:left="720" w:hanging="360"/>
+      </w:pPr>
+      <w:rPr>
+        <w:rFonts w:ascii="Aptos" w:eastAsiaTheme="minorHAnsi" w:hAnsi="Aptos" w:cstheme="minorBidi" w:hint="default"/>
+      </w:rPr>
+    </w:lvl>
+    <w:lvl w:ilvl="1" w:tplc="04090003" w:tentative="1">
+      <w:start w:val="1"/>
+      <w:numFmt w:val="bullet"/>
+      <w:lvlText w:val="o"/>
+      <w:lvlJc w:val="left"/>
+      <w:pPr>
+        <w:ind w:left="1440" w:hanging="360"/>
+      </w:pPr>
+      <w:rPr>
+        <w:rFonts w:ascii="Courier New" w:hAnsi="Courier New" w:cs="Courier New" w:hint="default"/>
+      </w:rPr>
+    </w:lvl>
+    <w:lvl w:ilvl="2" w:tplc="04090005" w:tentative="1">
+      <w:start w:val="1"/>
+      <w:numFmt w:val="bullet"/>
+      <w:lvlText w:val=""/>
+      <w:lvlJc w:val="left"/>
+      <w:pPr>
+        <w:ind w:left="2160" w:hanging="360"/>
+      </w:pPr>
+      <w:rPr>
+        <w:rFonts w:ascii="Wingdings" w:hAnsi="Wingdings" w:hint="default"/>
+      </w:rPr>
+    </w:lvl>
+    <w:lvl w:ilvl="3" w:tplc="04090001" w:tentative="1">
+      <w:start w:val="1"/>
+      <w:numFmt w:val="bullet"/>
+      <w:lvlText w:val=""/>
+      <w:lvlJc w:val="left"/>
+      <w:pPr>
+        <w:ind w:left="2880" w:hanging="360"/>
+      </w:pPr>
+      <w:rPr>
+        <w:rFonts w:ascii="Symbol" w:hAnsi="Symbol" w:hint="default"/>
+      </w:rPr>
+    </w:lvl>
+    <w:lvl w:ilvl="4" w:tplc="04090003" w:tentative="1">
+      <w:start w:val="1"/>
+      <w:numFmt w:val="bullet"/>
+      <w:lvlText w:val="o"/>
+      <w:lvlJc w:val="left"/>
+      <w:pPr>
+        <w:ind w:left="3600" w:hanging="360"/>
+      </w:pPr>
+      <w:rPr>
+        <w:rFonts w:ascii="Courier New" w:hAnsi="Courier New" w:cs="Courier New" w:hint="default"/>
+      </w:rPr>
+    </w:lvl>
+    <w:lvl w:ilvl="5" w:tplc="04090005" w:tentative="1">
+      <w:start w:val="1"/>
+      <w:numFmt w:val="bullet"/>
+      <w:lvlText w:val=""/>
+      <w:lvlJc w:val="left"/>
+      <w:pPr>
+        <w:ind w:left="4320" w:hanging="360"/>
+      </w:pPr>
+      <w:rPr>
+        <w:rFonts w:ascii="Wingdings" w:hAnsi="Wingdings" w:hint="default"/>
+      </w:rPr>
+    </w:lvl>
+    <w:lvl w:ilvl="6" w:tplc="04090001" w:tentative="1">
+      <w:start w:val="1"/>
+      <w:numFmt w:val="bullet"/>
+      <w:lvlText w:val=""/>
+      <w:lvlJc w:val="left"/>
+      <w:pPr>
+        <w:ind w:left="5040" w:hanging="360"/>
+      </w:pPr>
+      <w:rPr>
+        <w:rFonts w:ascii="Symbol" w:hAnsi="Symbol" w:hint="default"/>
+      </w:rPr>
+    </w:lvl>
+    <w:lvl w:ilvl="7" w:tplc="04090003" w:tentative="1">
+      <w:start w:val="1"/>
+      <w:numFmt w:val="bullet"/>
+      <w:lvlText w:val="o"/>
+      <w:lvlJc w:val="left"/>
+      <w:pPr>
+        <w:ind w:left="5760" w:hanging="360"/>
+      </w:pPr>
+      <w:rPr>
+        <w:rFonts w:ascii="Courier New" w:hAnsi="Courier New" w:cs="Courier New" w:hint="default"/>
+      </w:rPr>
+    </w:lvl>
+    <w:lvl w:ilvl="8" w:tplc="04090005" w:tentative="1">
+      <w:start w:val="1"/>
+      <w:numFmt w:val="bullet"/>
+      <w:lvlText w:val=""/>
+      <w:lvlJc w:val="left"/>
+      <w:pPr>
+        <w:ind w:left="6480" w:hanging="360"/>
+      </w:pPr>
+      <w:rPr>
+        <w:rFonts w:ascii="Wingdings" w:hAnsi="Wingdings" w:hint="default"/>
+      </w:rPr>
+    </w:lvl>
+  </w:abstractNum>
+  <w:num w:numId="1">
     <w:abstractNumId w:val="1"/>
   </w:num>
-  <w:num w:numId="2" w16cid:durableId="238177391">
+  <w:num w:numId="2">
     <w:abstractNumId w:val="0"/>
+  </w:num>
+  <w:num w:numId="3">
+    <w:abstractNumId w:val="3"/>
+  </w:num>
+  <w:num w:numId="4">
+    <w:abstractNumId w:val="2"/>
   </w:num>
 </w:numbering>
 </file>
 
 <file path=word/styles.xml><?xml version="1.0" encoding="utf-8"?>
-<w:styles xmlns:mc="http://schemas.openxmlformats.org/markup-compatibility/2006" xmlns:r="http://schemas.openxmlformats.org/officeDocument/2006/relationships" xmlns:w="http://schemas.openxmlformats.org/wordprocessingml/2006/main" xmlns:w14="http://schemas.microsoft.com/office/word/2010/wordml" xmlns:w15="http://schemas.microsoft.com/office/word/2012/wordml" xmlns:w16cex="http://schemas.microsoft.com/office/word/2018/wordml/cex" xmlns:w16cid="http://schemas.microsoft.com/office/word/2016/wordml/cid" xmlns:w16="http://schemas.microsoft.com/office/word/2018/wordml" xmlns:w16du="http://schemas.microsoft.com/office/word/2023/wordml/word16du" xmlns:w16sdtdh="http://schemas.microsoft.com/office/word/2020/wordml/sdtdatahash" xmlns:w16sdtfl="http://schemas.microsoft.com/office/word/2024/wordml/sdtformatlock" xmlns:w16se="http://schemas.microsoft.com/office/word/2015/wordml/symex" mc:Ignorable="w14 w15 w16se w16cid w16 w16cex w16sdtdh w16sdtfl w16du">
+<w:styles xmlns:mc="http://schemas.openxmlformats.org/markup-compatibility/2006" xmlns:r="http://schemas.openxmlformats.org/officeDocument/2006/relationships" xmlns:w="http://schemas.openxmlformats.org/wordprocessingml/2006/main" xmlns:w14="http://schemas.microsoft.com/office/word/2010/wordml" xmlns:w15="http://schemas.microsoft.com/office/word/2012/wordml" xmlns:w16cex="http://schemas.microsoft.com/office/word/2018/wordml/cex" xmlns:w16cid="http://schemas.microsoft.com/office/word/2016/wordml/cid" xmlns:w16="http://schemas.microsoft.com/office/word/2018/wordml" xmlns:w16sdtdh="http://schemas.microsoft.com/office/word/2020/wordml/sdtdatahash" xmlns:w16se="http://schemas.microsoft.com/office/word/2015/wordml/symex" mc:Ignorable="w14 w15 w16se w16cid w16 w16cex w16sdtdh">
   <w:docDefaults>
     <w:rPrDefault>
       <w:rPr>
@@ -3409,6 +4183,21 @@
       <w:bCs/>
     </w:rPr>
   </w:style>
+  <w:style w:type="character" w:customStyle="1" w:styleId="hljs-function">
+    <w:name w:val="hljs-function"/>
+    <w:basedOn w:val="DefaultParagraphFont"/>
+    <w:rsid w:val="00752994"/>
+  </w:style>
+  <w:style w:type="character" w:customStyle="1" w:styleId="hljs-title">
+    <w:name w:val="hljs-title"/>
+    <w:basedOn w:val="DefaultParagraphFont"/>
+    <w:rsid w:val="00752994"/>
+  </w:style>
+  <w:style w:type="character" w:customStyle="1" w:styleId="hljs-literal">
+    <w:name w:val="hljs-literal"/>
+    <w:basedOn w:val="DefaultParagraphFont"/>
+    <w:rsid w:val="00752994"/>
+  </w:style>
 </w:styles>
 </file>
 

</xml_diff>

<commit_message>
update-2 loguru cheat sheet
</commit_message>
<xml_diff>
--- a/Loguru cheat sheet.docx
+++ b/Loguru cheat sheet.docx
@@ -2092,10 +2092,8 @@
       </w:pPr>
       <w:proofErr w:type="gramStart"/>
       <w:r>
-        <w:t xml:space="preserve">Create </w:t>
-      </w:r>
-      <w:r>
-        <w:t xml:space="preserve"> </w:t>
+        <w:lastRenderedPageBreak/>
+        <w:t xml:space="preserve">Create  </w:t>
       </w:r>
       <w:r>
         <w:rPr>
@@ -2105,285 +2103,25 @@
           <w:szCs w:val="32"/>
           <w:highlight w:val="yellow"/>
         </w:rPr>
-        <w:t>module_name</w:t>
-      </w:r>
-      <w:r>
-        <w:rPr>
-          <w:rStyle w:val="HTMLCode"/>
-          <w:rFonts w:eastAsiaTheme="majorEastAsia"/>
-          <w:sz w:val="32"/>
-          <w:szCs w:val="32"/>
-          <w:highlight w:val="yellow"/>
-        </w:rPr>
-        <w:t>/logging_setup.py</w:t>
+        <w:t>module_name/logging_setup.py</w:t>
       </w:r>
       <w:proofErr w:type="gramEnd"/>
     </w:p>
     <w:p>
       <w:pPr>
         <w:rPr>
+          <w:noProof/>
+        </w:rPr>
+      </w:pPr>
+      <w:r>
+        <w:rPr>
           <w:rStyle w:val="hljs-keyword"/>
         </w:rPr>
-      </w:pPr>
-    </w:p>
-    <w:p>
-      <w:r>
-        <w:t>import sys</w:t>
-      </w:r>
-    </w:p>
-    <w:p>
-      <w:r>
-        <w:t xml:space="preserve">from </w:t>
-      </w:r>
-      <w:proofErr w:type="spellStart"/>
-      <w:r>
-        <w:t>loguru</w:t>
-      </w:r>
-      <w:proofErr w:type="spellEnd"/>
-      <w:r>
-        <w:t xml:space="preserve"> import logger</w:t>
-      </w:r>
-    </w:p>
-    <w:p/>
-    <w:p>
-      <w:r>
-        <w:t xml:space="preserve">def </w:t>
-      </w:r>
-      <w:proofErr w:type="spellStart"/>
-      <w:r>
-        <w:t>init_</w:t>
-      </w:r>
-      <w:proofErr w:type="gramStart"/>
-      <w:r>
-        <w:t>logging</w:t>
-      </w:r>
-      <w:proofErr w:type="spellEnd"/>
-      <w:r>
-        <w:t>(</w:t>
-      </w:r>
-      <w:proofErr w:type="gramEnd"/>
-      <w:r>
-        <w:t>):</w:t>
-      </w:r>
-    </w:p>
-    <w:p>
-      <w:r>
-        <w:t xml:space="preserve">    """Initializes the global </w:t>
-      </w:r>
-      <w:proofErr w:type="spellStart"/>
-      <w:r>
-        <w:t>Loguru</w:t>
-      </w:r>
-      <w:proofErr w:type="spellEnd"/>
-      <w:r>
-        <w:t xml:space="preserve"> logger configuration."""</w:t>
-      </w:r>
-    </w:p>
-    <w:p>
-      <w:r>
-        <w:t xml:space="preserve">    </w:t>
-      </w:r>
-      <w:proofErr w:type="spellStart"/>
-      <w:proofErr w:type="gramStart"/>
-      <w:r>
-        <w:t>logger.remove</w:t>
-      </w:r>
-      <w:proofErr w:type="spellEnd"/>
-      <w:proofErr w:type="gramEnd"/>
-      <w:r>
-        <w:t>()  # Clear default handler</w:t>
-      </w:r>
-    </w:p>
-    <w:p/>
-    <w:p>
-      <w:r>
-        <w:t xml:space="preserve">    # Console handler</w:t>
-      </w:r>
-      <w:r>
-        <w:t xml:space="preserve"> (displaying err in console IF exists)</w:t>
-      </w:r>
-    </w:p>
-    <w:p>
-      <w:r>
-        <w:t xml:space="preserve">    </w:t>
-      </w:r>
-      <w:proofErr w:type="spellStart"/>
-      <w:proofErr w:type="gramStart"/>
-      <w:r>
-        <w:t>logger.add</w:t>
-      </w:r>
-      <w:proofErr w:type="spellEnd"/>
-      <w:r>
-        <w:t>(</w:t>
-      </w:r>
-      <w:proofErr w:type="spellStart"/>
-      <w:proofErr w:type="gramEnd"/>
-      <w:r>
-        <w:t>sys.stderr</w:t>
-      </w:r>
-      <w:proofErr w:type="spellEnd"/>
-      <w:r>
-        <w:t>, level="INFO", colorize=True)</w:t>
-      </w:r>
-    </w:p>
-    <w:p/>
-    <w:p>
-      <w:r>
-        <w:t xml:space="preserve">    # File handler</w:t>
-      </w:r>
-    </w:p>
-    <w:p>
-      <w:r>
-        <w:t xml:space="preserve">    </w:t>
-      </w:r>
-      <w:proofErr w:type="spellStart"/>
-      <w:proofErr w:type="gramStart"/>
-      <w:r>
-        <w:t>logger.add</w:t>
-      </w:r>
-      <w:proofErr w:type="spellEnd"/>
-      <w:r>
-        <w:t>(</w:t>
-      </w:r>
-      <w:proofErr w:type="gramEnd"/>
-    </w:p>
-    <w:p>
-      <w:r>
-        <w:t xml:space="preserve">        "logs/app.log",</w:t>
-      </w:r>
-    </w:p>
-    <w:p>
-      <w:r>
-        <w:t xml:space="preserve">        rotation="10 MB",</w:t>
-      </w:r>
-    </w:p>
-    <w:p>
-      <w:r>
-        <w:t xml:space="preserve">        retention="7 days",</w:t>
-      </w:r>
-    </w:p>
-    <w:p>
-      <w:r>
-        <w:t xml:space="preserve">        enqueue=</w:t>
-      </w:r>
-      <w:proofErr w:type="gramStart"/>
-      <w:r>
-        <w:t>True,  #</w:t>
-      </w:r>
-      <w:proofErr w:type="gramEnd"/>
-      <w:r>
-        <w:t xml:space="preserve"> Keeps it safe for complex structures</w:t>
-      </w:r>
-    </w:p>
-    <w:p>
-      <w:r>
-        <w:t xml:space="preserve">        level="DEBUG"</w:t>
-      </w:r>
-      <w:r>
-        <w:t>,</w:t>
-      </w:r>
-    </w:p>
-    <w:p>
-      <w:r>
-        <w:t xml:space="preserve">        </w:t>
-      </w:r>
-      <w:proofErr w:type="spellStart"/>
-      <w:r>
-        <w:t>backtrace</w:t>
-      </w:r>
-      <w:proofErr w:type="spellEnd"/>
-      <w:r>
-        <w:t>=True,</w:t>
-      </w:r>
-    </w:p>
-    <w:p>
-      <w:r>
-        <w:rPr>
-          <w:rStyle w:val="hljs-builtin"/>
-        </w:rPr>
-        <w:t xml:space="preserve">       </w:t>
-      </w:r>
-      <w:r>
-        <w:rPr>
-          <w:rStyle w:val="hljs-builtin"/>
-        </w:rPr>
-        <w:t>format</w:t>
-      </w:r>
-      <w:r>
-        <w:t>=</w:t>
-      </w:r>
-      <w:r>
-        <w:rPr>
-          <w:rStyle w:val="hljs-string"/>
-        </w:rPr>
-        <w:t>"{time} | {level} | {name</w:t>
-      </w:r>
-      <w:proofErr w:type="gramStart"/>
-      <w:r>
-        <w:rPr>
-          <w:rStyle w:val="hljs-string"/>
-        </w:rPr>
-        <w:t>}:{</w:t>
-      </w:r>
-      <w:proofErr w:type="gramEnd"/>
-      <w:r>
-        <w:rPr>
-          <w:rStyle w:val="hljs-string"/>
-        </w:rPr>
-        <w:t>function}:{line} - {message}"</w:t>
-      </w:r>
-      <w:r>
-        <w:t>)</w:t>
-      </w:r>
-      <w:r>
-        <w:t xml:space="preserve">  # this will also provide name of the file(if multiple files) where err </w:t>
-      </w:r>
-      <w:proofErr w:type="spellStart"/>
-      <w:r>
-        <w:t>occured</w:t>
-      </w:r>
-      <w:proofErr w:type="spellEnd"/>
-    </w:p>
-    <w:p>
-      <w:r>
-        <w:t xml:space="preserve">    )</w:t>
-      </w:r>
-    </w:p>
-    <w:p/>
-    <w:p>
-      <w:pPr>
-        <w:pStyle w:val="Heading2"/>
-      </w:pPr>
-      <w:r>
-        <w:t>Use it in main.py</w:t>
-      </w:r>
-    </w:p>
-    <w:p>
-      <w:r>
-        <w:t xml:space="preserve">The key is to call the initialization function at the </w:t>
-      </w:r>
-      <w:r>
-        <w:rPr>
-          <w:b/>
-          <w:bCs/>
-        </w:rPr>
-        <w:t>very top</w:t>
-      </w:r>
-      <w:r>
-        <w:t xml:space="preserve"> of your entry script</w:t>
-      </w:r>
-      <w:r>
-        <w:t>, afterwards, add the rest of imports</w:t>
-      </w:r>
-    </w:p>
-    <w:p>
-      <w:r>
-        <w:lastRenderedPageBreak/>
         <w:drawing>
-          <wp:inline distT="0" distB="0" distL="0" distR="0" wp14:anchorId="673893F6" wp14:editId="79F05BFA">
-            <wp:extent cx="5943600" cy="2653665"/>
-            <wp:effectExtent l="0" t="0" r="0" b="0"/>
-            <wp:docPr id="1" name="Picture 1"/>
+          <wp:inline distT="0" distB="0" distL="0" distR="0" wp14:anchorId="3D879E88" wp14:editId="01BFD767">
+            <wp:extent cx="5943600" cy="4660265"/>
+            <wp:effectExtent l="0" t="0" r="0" b="6985"/>
+            <wp:docPr id="3" name="Picture 3"/>
             <wp:cNvGraphicFramePr>
               <a:graphicFrameLocks xmlns:a="http://schemas.openxmlformats.org/drawingml/2006/main" noChangeAspect="1"/>
             </wp:cNvGraphicFramePr>
@@ -2403,7 +2141,7 @@
                   <pic:spPr>
                     <a:xfrm>
                       <a:off x="0" y="0"/>
-                      <a:ext cx="5943600" cy="2653665"/>
+                      <a:ext cx="5943600" cy="4660265"/>
                     </a:xfrm>
                     <a:prstGeom prst="rect">
                       <a:avLst/>
@@ -2415,75 +2153,21 @@
           </wp:inline>
         </w:drawing>
       </w:r>
-    </w:p>
-    <w:p>
-      <w:pPr>
-        <w:pStyle w:val="Heading2"/>
-      </w:pPr>
-      <w:r>
-        <w:t>Use it in auxiliary modules</w:t>
-      </w:r>
-    </w:p>
-    <w:p>
-      <w:r>
-        <w:t xml:space="preserve">You </w:t>
-      </w:r>
-      <w:r>
-        <w:rPr>
-          <w:b/>
-          <w:bCs/>
-          <w:highlight w:val="yellow"/>
-        </w:rPr>
-        <w:t>must</w:t>
-      </w:r>
-      <w:r>
-        <w:rPr>
-          <w:highlight w:val="yellow"/>
-        </w:rPr>
-        <w:t xml:space="preserve"> import the logger here</w:t>
-      </w:r>
-      <w:r>
-        <w:t xml:space="preserve">. If you don't, Python won't know what </w:t>
-      </w:r>
-      <w:proofErr w:type="gramStart"/>
-      <w:r>
-        <w:rPr>
-          <w:rStyle w:val="HTMLCode"/>
-          <w:rFonts w:eastAsiaTheme="majorEastAsia"/>
-        </w:rPr>
-        <w:t>logger.info(</w:t>
-      </w:r>
-      <w:proofErr w:type="gramEnd"/>
-      <w:r>
-        <w:rPr>
-          <w:rStyle w:val="HTMLCode"/>
-          <w:rFonts w:eastAsiaTheme="majorEastAsia"/>
-        </w:rPr>
-        <w:t>)</w:t>
-      </w:r>
-      <w:r>
-        <w:t xml:space="preserve"> means.</w:t>
-      </w:r>
-    </w:p>
-    <w:p>
-      <w:pPr>
-        <w:pStyle w:val="ListParagraph"/>
-        <w:numPr>
-          <w:ilvl w:val="0"/>
-          <w:numId w:val="3"/>
-        </w:numPr>
-      </w:pPr>
-      <w:r>
-        <w:t>MUST be imported within ALL files where logging is necessary</w:t>
-      </w:r>
-    </w:p>
-    <w:p>
-      <w:r>
+      <w:r>
+        <w:rPr>
+          <w:noProof/>
+        </w:rPr>
+        <w:t xml:space="preserve"> </w:t>
+      </w:r>
+      <w:r>
+        <w:rPr>
+          <w:rStyle w:val="hljs-keyword"/>
+        </w:rPr>
         <w:drawing>
-          <wp:inline distT="0" distB="0" distL="0" distR="0" wp14:anchorId="492F27A7" wp14:editId="02A4DB0B">
-            <wp:extent cx="5943600" cy="1139190"/>
-            <wp:effectExtent l="0" t="0" r="0" b="3810"/>
-            <wp:docPr id="2" name="Picture 2"/>
+          <wp:inline distT="0" distB="0" distL="0" distR="0" wp14:anchorId="005C8724" wp14:editId="0357406A">
+            <wp:extent cx="5943600" cy="1995170"/>
+            <wp:effectExtent l="0" t="0" r="0" b="5080"/>
+            <wp:docPr id="4" name="Picture 4"/>
             <wp:cNvGraphicFramePr>
               <a:graphicFrameLocks xmlns:a="http://schemas.openxmlformats.org/drawingml/2006/main" noChangeAspect="1"/>
             </wp:cNvGraphicFramePr>
@@ -2503,6 +2187,391 @@
                   <pic:spPr>
                     <a:xfrm>
                       <a:off x="0" y="0"/>
+                      <a:ext cx="5943600" cy="1995170"/>
+                    </a:xfrm>
+                    <a:prstGeom prst="rect">
+                      <a:avLst/>
+                    </a:prstGeom>
+                  </pic:spPr>
+                </pic:pic>
+              </a:graphicData>
+            </a:graphic>
+          </wp:inline>
+        </w:drawing>
+      </w:r>
+    </w:p>
+    <w:p>
+      <w:pPr>
+        <w:rPr>
+          <w:rStyle w:val="hljs-keyword"/>
+        </w:rPr>
+      </w:pPr>
+    </w:p>
+    <w:p>
+      <w:r>
+        <w:t>import sys</w:t>
+      </w:r>
+    </w:p>
+    <w:p>
+      <w:r>
+        <w:t xml:space="preserve">from </w:t>
+      </w:r>
+      <w:proofErr w:type="spellStart"/>
+      <w:r>
+        <w:t>loguru</w:t>
+      </w:r>
+      <w:proofErr w:type="spellEnd"/>
+      <w:r>
+        <w:t xml:space="preserve"> import logger</w:t>
+      </w:r>
+    </w:p>
+    <w:p/>
+    <w:p>
+      <w:r>
+        <w:t xml:space="preserve">def </w:t>
+      </w:r>
+      <w:proofErr w:type="spellStart"/>
+      <w:r>
+        <w:t>init_</w:t>
+      </w:r>
+      <w:proofErr w:type="gramStart"/>
+      <w:r>
+        <w:t>logging</w:t>
+      </w:r>
+      <w:proofErr w:type="spellEnd"/>
+      <w:r>
+        <w:t>(</w:t>
+      </w:r>
+      <w:proofErr w:type="gramEnd"/>
+      <w:r>
+        <w:t>):</w:t>
+      </w:r>
+    </w:p>
+    <w:p>
+      <w:r>
+        <w:t xml:space="preserve">    """Initializes the global </w:t>
+      </w:r>
+      <w:proofErr w:type="spellStart"/>
+      <w:r>
+        <w:t>Loguru</w:t>
+      </w:r>
+      <w:proofErr w:type="spellEnd"/>
+      <w:r>
+        <w:t xml:space="preserve"> logger configuration."""</w:t>
+      </w:r>
+    </w:p>
+    <w:p>
+      <w:r>
+        <w:t xml:space="preserve">    </w:t>
+      </w:r>
+      <w:proofErr w:type="spellStart"/>
+      <w:proofErr w:type="gramStart"/>
+      <w:r>
+        <w:t>logger.remove</w:t>
+      </w:r>
+      <w:proofErr w:type="spellEnd"/>
+      <w:proofErr w:type="gramEnd"/>
+      <w:r>
+        <w:t>()  # Clear default handler</w:t>
+      </w:r>
+    </w:p>
+    <w:p/>
+    <w:p>
+      <w:r>
+        <w:t xml:space="preserve">    # Console handler (displaying err in console IF exists)</w:t>
+      </w:r>
+    </w:p>
+    <w:p>
+      <w:r>
+        <w:t xml:space="preserve">    </w:t>
+      </w:r>
+      <w:proofErr w:type="spellStart"/>
+      <w:proofErr w:type="gramStart"/>
+      <w:r>
+        <w:t>logger.add</w:t>
+      </w:r>
+      <w:proofErr w:type="spellEnd"/>
+      <w:r>
+        <w:t>(</w:t>
+      </w:r>
+      <w:proofErr w:type="spellStart"/>
+      <w:proofErr w:type="gramEnd"/>
+      <w:r>
+        <w:t>sys.stderr</w:t>
+      </w:r>
+      <w:proofErr w:type="spellEnd"/>
+      <w:r>
+        <w:t>, level="INFO", colorize=True)</w:t>
+      </w:r>
+    </w:p>
+    <w:p/>
+    <w:p>
+      <w:r>
+        <w:t xml:space="preserve">    # File handler</w:t>
+      </w:r>
+    </w:p>
+    <w:p>
+      <w:r>
+        <w:t xml:space="preserve">    </w:t>
+      </w:r>
+      <w:proofErr w:type="spellStart"/>
+      <w:proofErr w:type="gramStart"/>
+      <w:r>
+        <w:t>logger.add</w:t>
+      </w:r>
+      <w:proofErr w:type="spellEnd"/>
+      <w:r>
+        <w:t>(</w:t>
+      </w:r>
+      <w:proofErr w:type="gramEnd"/>
+    </w:p>
+    <w:p>
+      <w:r>
+        <w:t xml:space="preserve">        "logs/app.log",</w:t>
+      </w:r>
+    </w:p>
+    <w:p>
+      <w:r>
+        <w:t xml:space="preserve">        rotation="10 MB",</w:t>
+      </w:r>
+    </w:p>
+    <w:p>
+      <w:r>
+        <w:t xml:space="preserve">        retention="7 days",</w:t>
+      </w:r>
+    </w:p>
+    <w:p>
+      <w:r>
+        <w:t xml:space="preserve">        enqueue=</w:t>
+      </w:r>
+      <w:proofErr w:type="gramStart"/>
+      <w:r>
+        <w:t>True,  #</w:t>
+      </w:r>
+      <w:proofErr w:type="gramEnd"/>
+      <w:r>
+        <w:t xml:space="preserve"> Keeps it safe for complex structures</w:t>
+      </w:r>
+    </w:p>
+    <w:p>
+      <w:r>
+        <w:t xml:space="preserve">        level="DEBUG",</w:t>
+      </w:r>
+    </w:p>
+    <w:p>
+      <w:r>
+        <w:t xml:space="preserve">        </w:t>
+      </w:r>
+      <w:proofErr w:type="spellStart"/>
+      <w:r>
+        <w:t>backtrace</w:t>
+      </w:r>
+      <w:proofErr w:type="spellEnd"/>
+      <w:r>
+        <w:t>=True,</w:t>
+      </w:r>
+    </w:p>
+    <w:p>
+      <w:r>
+        <w:rPr>
+          <w:rStyle w:val="hljs-builtin"/>
+        </w:rPr>
+        <w:t xml:space="preserve">       format</w:t>
+      </w:r>
+      <w:r>
+        <w:t>=</w:t>
+      </w:r>
+      <w:r>
+        <w:rPr>
+          <w:rStyle w:val="hljs-string"/>
+        </w:rPr>
+        <w:t>"{time} | {level} | {name</w:t>
+      </w:r>
+      <w:proofErr w:type="gramStart"/>
+      <w:r>
+        <w:rPr>
+          <w:rStyle w:val="hljs-string"/>
+        </w:rPr>
+        <w:t>}:{</w:t>
+      </w:r>
+      <w:proofErr w:type="gramEnd"/>
+      <w:r>
+        <w:rPr>
+          <w:rStyle w:val="hljs-string"/>
+        </w:rPr>
+        <w:t>function}:{line} - {message}"</w:t>
+      </w:r>
+      <w:r>
+        <w:t xml:space="preserve">)  # this will also provide name of the file(if multiple files) where err </w:t>
+      </w:r>
+      <w:proofErr w:type="spellStart"/>
+      <w:r>
+        <w:t>occured</w:t>
+      </w:r>
+      <w:proofErr w:type="spellEnd"/>
+    </w:p>
+    <w:p>
+      <w:r>
+        <w:t xml:space="preserve">    )</w:t>
+      </w:r>
+    </w:p>
+    <w:p/>
+    <w:p>
+      <w:pPr>
+        <w:pStyle w:val="Heading2"/>
+      </w:pPr>
+      <w:r>
+        <w:t>Use it in main.py</w:t>
+      </w:r>
+    </w:p>
+    <w:p>
+      <w:r>
+        <w:t xml:space="preserve">The key is to call the initialization function at the </w:t>
+      </w:r>
+      <w:r>
+        <w:rPr>
+          <w:b/>
+          <w:bCs/>
+        </w:rPr>
+        <w:t>very top</w:t>
+      </w:r>
+      <w:r>
+        <w:t xml:space="preserve"> of your entry script, afterwards, add the rest of imports</w:t>
+      </w:r>
+    </w:p>
+    <w:p>
+      <w:r>
+        <w:rPr>
+          <w:noProof/>
+        </w:rPr>
+        <w:lastRenderedPageBreak/>
+        <w:drawing>
+          <wp:inline distT="0" distB="0" distL="0" distR="0" wp14:anchorId="673893F6" wp14:editId="79F05BFA">
+            <wp:extent cx="5943600" cy="2653665"/>
+            <wp:effectExtent l="0" t="0" r="0" b="0"/>
+            <wp:docPr id="1" name="Picture 1"/>
+            <wp:cNvGraphicFramePr>
+              <a:graphicFrameLocks xmlns:a="http://schemas.openxmlformats.org/drawingml/2006/main" noChangeAspect="1"/>
+            </wp:cNvGraphicFramePr>
+            <a:graphic xmlns:a="http://schemas.openxmlformats.org/drawingml/2006/main">
+              <a:graphicData uri="http://schemas.openxmlformats.org/drawingml/2006/picture">
+                <pic:pic xmlns:pic="http://schemas.openxmlformats.org/drawingml/2006/picture">
+                  <pic:nvPicPr>
+                    <pic:cNvPr id="1" name=""/>
+                    <pic:cNvPicPr/>
+                  </pic:nvPicPr>
+                  <pic:blipFill>
+                    <a:blip r:embed="rId16"/>
+                    <a:stretch>
+                      <a:fillRect/>
+                    </a:stretch>
+                  </pic:blipFill>
+                  <pic:spPr>
+                    <a:xfrm>
+                      <a:off x="0" y="0"/>
+                      <a:ext cx="5943600" cy="2653665"/>
+                    </a:xfrm>
+                    <a:prstGeom prst="rect">
+                      <a:avLst/>
+                    </a:prstGeom>
+                  </pic:spPr>
+                </pic:pic>
+              </a:graphicData>
+            </a:graphic>
+          </wp:inline>
+        </w:drawing>
+      </w:r>
+    </w:p>
+    <w:p>
+      <w:pPr>
+        <w:pStyle w:val="Heading2"/>
+      </w:pPr>
+      <w:r>
+        <w:t>Use it in auxiliary modules</w:t>
+      </w:r>
+    </w:p>
+    <w:p>
+      <w:r>
+        <w:t xml:space="preserve">You </w:t>
+      </w:r>
+      <w:r>
+        <w:rPr>
+          <w:b/>
+          <w:bCs/>
+          <w:highlight w:val="yellow"/>
+        </w:rPr>
+        <w:t>must</w:t>
+      </w:r>
+      <w:r>
+        <w:rPr>
+          <w:highlight w:val="yellow"/>
+        </w:rPr>
+        <w:t xml:space="preserve"> import the logger here</w:t>
+      </w:r>
+      <w:r>
+        <w:t xml:space="preserve">. If you don't, Python won't know what </w:t>
+      </w:r>
+      <w:proofErr w:type="gramStart"/>
+      <w:r>
+        <w:rPr>
+          <w:rStyle w:val="HTMLCode"/>
+          <w:rFonts w:eastAsiaTheme="majorEastAsia"/>
+        </w:rPr>
+        <w:t>logger.info(</w:t>
+      </w:r>
+      <w:proofErr w:type="gramEnd"/>
+      <w:r>
+        <w:rPr>
+          <w:rStyle w:val="HTMLCode"/>
+          <w:rFonts w:eastAsiaTheme="majorEastAsia"/>
+        </w:rPr>
+        <w:t>)</w:t>
+      </w:r>
+      <w:r>
+        <w:t xml:space="preserve"> means.</w:t>
+      </w:r>
+    </w:p>
+    <w:p>
+      <w:pPr>
+        <w:pStyle w:val="ListParagraph"/>
+        <w:numPr>
+          <w:ilvl w:val="0"/>
+          <w:numId w:val="3"/>
+        </w:numPr>
+      </w:pPr>
+      <w:r>
+        <w:t>MUST be imported within ALL files where logging is necessary</w:t>
+      </w:r>
+    </w:p>
+    <w:p>
+      <w:r>
+        <w:rPr>
+          <w:noProof/>
+        </w:rPr>
+        <w:drawing>
+          <wp:inline distT="0" distB="0" distL="0" distR="0" wp14:anchorId="492F27A7" wp14:editId="02A4DB0B">
+            <wp:extent cx="5943600" cy="1139190"/>
+            <wp:effectExtent l="0" t="0" r="0" b="3810"/>
+            <wp:docPr id="2" name="Picture 2"/>
+            <wp:cNvGraphicFramePr>
+              <a:graphicFrameLocks xmlns:a="http://schemas.openxmlformats.org/drawingml/2006/main" noChangeAspect="1"/>
+            </wp:cNvGraphicFramePr>
+            <a:graphic xmlns:a="http://schemas.openxmlformats.org/drawingml/2006/main">
+              <a:graphicData uri="http://schemas.openxmlformats.org/drawingml/2006/picture">
+                <pic:pic xmlns:pic="http://schemas.openxmlformats.org/drawingml/2006/picture">
+                  <pic:nvPicPr>
+                    <pic:cNvPr id="1" name=""/>
+                    <pic:cNvPicPr/>
+                  </pic:nvPicPr>
+                  <pic:blipFill>
+                    <a:blip r:embed="rId17"/>
+                    <a:stretch>
+                      <a:fillRect/>
+                    </a:stretch>
+                  </pic:blipFill>
+                  <pic:spPr>
+                    <a:xfrm>
+                      <a:off x="0" y="0"/>
                       <a:ext cx="5943600" cy="1139190"/>
                     </a:xfrm>
                     <a:prstGeom prst="rect">
@@ -2536,10 +2605,7 @@
       </w:r>
       <w:proofErr w:type="spellEnd"/>
       <w:r>
-        <w:t xml:space="preserve"> is smart enough to realize they are all part of the same application. It treats them all as one single stream of </w:t>
-      </w:r>
-      <w:r>
-        <w:t>information</w:t>
+        <w:t xml:space="preserve"> is smart enough to realize they are all part of the same application. It treats them all as one single stream of information</w:t>
       </w:r>
     </w:p>
     <w:p>
@@ -2654,6 +2720,138 @@
       <w:r>
         <w:t xml:space="preserve"> Never put these in your auxiliary files, or you'll end up with 10 different log files or duplicate lines.</w:t>
       </w:r>
+    </w:p>
+    <w:p>
+      <w:pPr>
+        <w:pStyle w:val="NormalWeb"/>
+      </w:pPr>
+      <w:proofErr w:type="gramStart"/>
+      <w:r>
+        <w:rPr>
+          <w:rFonts w:hAnsi="Symbol"/>
+        </w:rPr>
+        <w:t></w:t>
+      </w:r>
+      <w:r>
+        <w:t xml:space="preserve">  </w:t>
+      </w:r>
+      <w:proofErr w:type="spellStart"/>
+      <w:r>
+        <w:rPr>
+          <w:rStyle w:val="HTMLCode"/>
+          <w:rFonts w:eastAsiaTheme="majorEastAsia"/>
+          <w:b/>
+          <w:bCs/>
+        </w:rPr>
+        <w:t>backtrace</w:t>
+      </w:r>
+      <w:proofErr w:type="spellEnd"/>
+      <w:proofErr w:type="gramEnd"/>
+      <w:r>
+        <w:rPr>
+          <w:rStyle w:val="HTMLCode"/>
+          <w:rFonts w:eastAsiaTheme="majorEastAsia"/>
+          <w:b/>
+          <w:bCs/>
+        </w:rPr>
+        <w:t>=True</w:t>
+      </w:r>
+      <w:r>
+        <w:t>: Shows the full stack trace (the "path" the code took to get to the error).</w:t>
+      </w:r>
+    </w:p>
+    <w:p>
+      <w:pPr>
+        <w:pStyle w:val="NormalWeb"/>
+      </w:pPr>
+      <w:proofErr w:type="gramStart"/>
+      <w:r>
+        <w:rPr>
+          <w:rFonts w:hAnsi="Symbol"/>
+        </w:rPr>
+        <w:t></w:t>
+      </w:r>
+      <w:r>
+        <w:t xml:space="preserve">  </w:t>
+      </w:r>
+      <w:r>
+        <w:rPr>
+          <w:rStyle w:val="HTMLCode"/>
+          <w:rFonts w:eastAsiaTheme="majorEastAsia"/>
+          <w:b/>
+          <w:bCs/>
+        </w:rPr>
+        <w:t>diagnose</w:t>
+      </w:r>
+      <w:proofErr w:type="gramEnd"/>
+      <w:r>
+        <w:rPr>
+          <w:rStyle w:val="HTMLCode"/>
+          <w:rFonts w:eastAsiaTheme="majorEastAsia"/>
+          <w:b/>
+          <w:bCs/>
+        </w:rPr>
+        <w:t>=True</w:t>
+      </w:r>
+      <w:r>
+        <w:t xml:space="preserve">: (Optional) This actually shows the </w:t>
+      </w:r>
+      <w:r>
+        <w:rPr>
+          <w:b/>
+          <w:bCs/>
+        </w:rPr>
+        <w:t>values of the variables</w:t>
+      </w:r>
+      <w:r>
+        <w:t xml:space="preserve"> at the time of the crash.</w:t>
+      </w:r>
+    </w:p>
+    <w:p>
+      <w:pPr>
+        <w:pStyle w:val="NormalWeb"/>
+        <w:numPr>
+          <w:ilvl w:val="0"/>
+          <w:numId w:val="4"/>
+        </w:numPr>
+      </w:pPr>
+      <w:r>
+        <w:rPr>
+          <w:i/>
+          <w:iCs/>
+          <w:highlight w:val="red"/>
+        </w:rPr>
+        <w:t>Warning</w:t>
+      </w:r>
+      <w:r>
+        <w:rPr>
+          <w:i/>
+          <w:iCs/>
+        </w:rPr>
+        <w:t>:</w:t>
+      </w:r>
+      <w:r>
+        <w:t xml:space="preserve"> Don't use </w:t>
+      </w:r>
+      <w:r>
+        <w:rPr>
+          <w:rStyle w:val="HTMLCode"/>
+          <w:rFonts w:eastAsiaTheme="majorEastAsia"/>
+        </w:rPr>
+        <w:t>diagnose=True</w:t>
+      </w:r>
+      <w:r>
+        <w:t xml:space="preserve"> in production if your code handles sensitive data (like passwords), as those values might end up in the log file.</w:t>
+      </w:r>
+    </w:p>
+    <w:p>
+      <w:pPr>
+        <w:pStyle w:val="NormalWeb"/>
+        <w:numPr>
+          <w:ilvl w:val="0"/>
+          <w:numId w:val="4"/>
+        </w:numPr>
+      </w:pPr>
     </w:p>
     <w:p/>
     <w:sectPr>
@@ -3131,6 +3329,155 @@
       </w:rPr>
     </w:lvl>
   </w:abstractNum>
+  <w:abstractNum w:abstractNumId="4" w15:restartNumberingAfterBreak="0">
+    <w:nsid w:val="765146FD"/>
+    <w:multiLevelType w:val="multilevel"/>
+    <w:tmpl w:val="32D68EAC"/>
+    <w:lvl w:ilvl="0">
+      <w:start w:val="1"/>
+      <w:numFmt w:val="bullet"/>
+      <w:lvlText w:val=""/>
+      <w:lvlJc w:val="left"/>
+      <w:pPr>
+        <w:tabs>
+          <w:tab w:val="num" w:pos="720"/>
+        </w:tabs>
+        <w:ind w:left="720" w:hanging="360"/>
+      </w:pPr>
+      <w:rPr>
+        <w:rFonts w:ascii="Symbol" w:hAnsi="Symbol" w:hint="default"/>
+        <w:sz w:val="20"/>
+      </w:rPr>
+    </w:lvl>
+    <w:lvl w:ilvl="1" w:tentative="1">
+      <w:start w:val="1"/>
+      <w:numFmt w:val="bullet"/>
+      <w:lvlText w:val="o"/>
+      <w:lvlJc w:val="left"/>
+      <w:pPr>
+        <w:tabs>
+          <w:tab w:val="num" w:pos="1440"/>
+        </w:tabs>
+        <w:ind w:left="1440" w:hanging="360"/>
+      </w:pPr>
+      <w:rPr>
+        <w:rFonts w:ascii="Courier New" w:hAnsi="Courier New" w:hint="default"/>
+        <w:sz w:val="20"/>
+      </w:rPr>
+    </w:lvl>
+    <w:lvl w:ilvl="2" w:tentative="1">
+      <w:start w:val="1"/>
+      <w:numFmt w:val="bullet"/>
+      <w:lvlText w:val=""/>
+      <w:lvlJc w:val="left"/>
+      <w:pPr>
+        <w:tabs>
+          <w:tab w:val="num" w:pos="2160"/>
+        </w:tabs>
+        <w:ind w:left="2160" w:hanging="360"/>
+      </w:pPr>
+      <w:rPr>
+        <w:rFonts w:ascii="Wingdings" w:hAnsi="Wingdings" w:hint="default"/>
+        <w:sz w:val="20"/>
+      </w:rPr>
+    </w:lvl>
+    <w:lvl w:ilvl="3" w:tentative="1">
+      <w:start w:val="1"/>
+      <w:numFmt w:val="bullet"/>
+      <w:lvlText w:val=""/>
+      <w:lvlJc w:val="left"/>
+      <w:pPr>
+        <w:tabs>
+          <w:tab w:val="num" w:pos="2880"/>
+        </w:tabs>
+        <w:ind w:left="2880" w:hanging="360"/>
+      </w:pPr>
+      <w:rPr>
+        <w:rFonts w:ascii="Wingdings" w:hAnsi="Wingdings" w:hint="default"/>
+        <w:sz w:val="20"/>
+      </w:rPr>
+    </w:lvl>
+    <w:lvl w:ilvl="4" w:tentative="1">
+      <w:start w:val="1"/>
+      <w:numFmt w:val="bullet"/>
+      <w:lvlText w:val=""/>
+      <w:lvlJc w:val="left"/>
+      <w:pPr>
+        <w:tabs>
+          <w:tab w:val="num" w:pos="3600"/>
+        </w:tabs>
+        <w:ind w:left="3600" w:hanging="360"/>
+      </w:pPr>
+      <w:rPr>
+        <w:rFonts w:ascii="Wingdings" w:hAnsi="Wingdings" w:hint="default"/>
+        <w:sz w:val="20"/>
+      </w:rPr>
+    </w:lvl>
+    <w:lvl w:ilvl="5" w:tentative="1">
+      <w:start w:val="1"/>
+      <w:numFmt w:val="bullet"/>
+      <w:lvlText w:val=""/>
+      <w:lvlJc w:val="left"/>
+      <w:pPr>
+        <w:tabs>
+          <w:tab w:val="num" w:pos="4320"/>
+        </w:tabs>
+        <w:ind w:left="4320" w:hanging="360"/>
+      </w:pPr>
+      <w:rPr>
+        <w:rFonts w:ascii="Wingdings" w:hAnsi="Wingdings" w:hint="default"/>
+        <w:sz w:val="20"/>
+      </w:rPr>
+    </w:lvl>
+    <w:lvl w:ilvl="6" w:tentative="1">
+      <w:start w:val="1"/>
+      <w:numFmt w:val="bullet"/>
+      <w:lvlText w:val=""/>
+      <w:lvlJc w:val="left"/>
+      <w:pPr>
+        <w:tabs>
+          <w:tab w:val="num" w:pos="5040"/>
+        </w:tabs>
+        <w:ind w:left="5040" w:hanging="360"/>
+      </w:pPr>
+      <w:rPr>
+        <w:rFonts w:ascii="Wingdings" w:hAnsi="Wingdings" w:hint="default"/>
+        <w:sz w:val="20"/>
+      </w:rPr>
+    </w:lvl>
+    <w:lvl w:ilvl="7" w:tentative="1">
+      <w:start w:val="1"/>
+      <w:numFmt w:val="bullet"/>
+      <w:lvlText w:val=""/>
+      <w:lvlJc w:val="left"/>
+      <w:pPr>
+        <w:tabs>
+          <w:tab w:val="num" w:pos="5760"/>
+        </w:tabs>
+        <w:ind w:left="5760" w:hanging="360"/>
+      </w:pPr>
+      <w:rPr>
+        <w:rFonts w:ascii="Wingdings" w:hAnsi="Wingdings" w:hint="default"/>
+        <w:sz w:val="20"/>
+      </w:rPr>
+    </w:lvl>
+    <w:lvl w:ilvl="8" w:tentative="1">
+      <w:start w:val="1"/>
+      <w:numFmt w:val="bullet"/>
+      <w:lvlText w:val=""/>
+      <w:lvlJc w:val="left"/>
+      <w:pPr>
+        <w:tabs>
+          <w:tab w:val="num" w:pos="6480"/>
+        </w:tabs>
+        <w:ind w:left="6480" w:hanging="360"/>
+      </w:pPr>
+      <w:rPr>
+        <w:rFonts w:ascii="Wingdings" w:hAnsi="Wingdings" w:hint="default"/>
+        <w:sz w:val="20"/>
+      </w:rPr>
+    </w:lvl>
+  </w:abstractNum>
   <w:num w:numId="1">
     <w:abstractNumId w:val="1"/>
   </w:num>
@@ -3142,6 +3489,9 @@
   </w:num>
   <w:num w:numId="4">
     <w:abstractNumId w:val="2"/>
+  </w:num>
+  <w:num w:numId="5">
+    <w:abstractNumId w:val="4"/>
   </w:num>
 </w:numbering>
 </file>

</xml_diff>